<commit_message>
gmail time and date
</commit_message>
<xml_diff>
--- a/JOSHUA TEVERA Cv.docx
+++ b/JOSHUA TEVERA Cv.docx
@@ -15,6 +15,13 @@
           <w:bCs/>
         </w:rPr>
         <w:t>JOSHUA TEVERA</w:t>
+      </w:r>
+      <w:r>
+        <w:rPr>
+          <w:b/>
+          <w:bCs/>
+        </w:rPr>
+        <w:t xml:space="preserve"> CV.</w:t>
       </w:r>
     </w:p>
     <w:p>
@@ -185,7 +192,25 @@
     </w:p>
     <w:p>
       <w:r>
-        <w:t>Software Engineering student and full-stack developer with hands-on experience building production-ready web applications using Django, Node.js, and React. Experienced in RESTful API development, AI-assisted systems, and database-driven platforms. Passionate about solving real-world proble</w:t>
+        <w:t xml:space="preserve">Software Engineering student and full-stack developer with hands-on experience building production-ready web applications using Django, Node.js, </w:t>
+      </w:r>
+      <w:r>
+        <w:t xml:space="preserve">React </w:t>
+      </w:r>
+      <w:r>
+        <w:t>and React</w:t>
+      </w:r>
+      <w:r>
+        <w:t xml:space="preserve"> Native</w:t>
+      </w:r>
+      <w:r>
+        <w:t>. Experienced in RESTful API development, AI-assisted systems and database</w:t>
+      </w:r>
+      <w:r>
+        <w:t xml:space="preserve"> </w:t>
+      </w:r>
+      <w:r>
+        <w:t>driven platforms. Passionate about solving real-world proble</w:t>
       </w:r>
       <w:r>
         <w:t>ms.</w:t>
@@ -253,7 +278,10 @@
         <w:t>SQLite, MySQL, Firebase</w:t>
       </w:r>
       <w:r>
-        <w:t xml:space="preserve">, Postgres </w:t>
+        <w:t xml:space="preserve">, </w:t>
+      </w:r>
+      <w:r>
+        <w:t>PostgreSQL</w:t>
       </w:r>
     </w:p>
     <w:p>
@@ -266,10 +294,13 @@
       </w:r>
       <w:r>
         <w:br/>
-        <w:t>Git, GitHub, VS Code</w:t>
-      </w:r>
-      <w:r>
-        <w:t>, Docker</w:t>
+        <w:t>Git, GitHub,</w:t>
+      </w:r>
+      <w:r>
+        <w:t xml:space="preserve"> </w:t>
+      </w:r>
+      <w:r>
+        <w:t>Docker</w:t>
       </w:r>
     </w:p>
     <w:p>
@@ -393,7 +424,7 @@
           <w:b/>
           <w:bCs/>
         </w:rPr>
-        <w:t>Django | React | TypeScript | PostgreSQL | Google Gemini API | Docker</w:t>
+        <w:t>Django | React | TypeScript | PostgreSQL | Google Gemini API</w:t>
       </w:r>
     </w:p>
     <w:p>
@@ -525,7 +556,15 @@
           <w:bCs/>
           <w:u w:val="single"/>
         </w:rPr>
-        <w:t>t the Doctor Online (AI Doctor &amp; Booking Platform) | Full-Stack Developer</w:t>
+        <w:t>t the Doctor Online (AI Doctor &amp; Booking Platform)</w:t>
+      </w:r>
+      <w:r>
+        <w:rPr>
+          <w:b/>
+          <w:bCs/>
+          <w:u w:val="single"/>
+        </w:rPr>
+        <w:t xml:space="preserve"> </w:t>
       </w:r>
       <w:r>
         <w:rPr>
@@ -589,8 +628,6 @@
         <w:t>Improves access to healthcare services by providing virtual medical assistance and streamlined doctor booking.</w:t>
       </w:r>
     </w:p>
-    <w:p/>
-    <w:p/>
     <w:p>
       <w:r>
         <w:pict w14:anchorId="249FD949">
@@ -635,7 +672,47 @@
           <w:bCs/>
           <w:u w:val="single"/>
         </w:rPr>
-        <w:t xml:space="preserve"> Finder – Location-Based Marketplace | Full-Stack Developer</w:t>
+        <w:t>-</w:t>
+      </w:r>
+      <w:r>
+        <w:rPr>
+          <w:b/>
+          <w:bCs/>
+          <w:u w:val="single"/>
+        </w:rPr>
+        <w:t>Finder Location</w:t>
+      </w:r>
+      <w:r>
+        <w:rPr>
+          <w:b/>
+          <w:bCs/>
+          <w:u w:val="single"/>
+        </w:rPr>
+        <w:t xml:space="preserve"> </w:t>
+      </w:r>
+      <w:r>
+        <w:rPr>
+          <w:b/>
+          <w:bCs/>
+          <w:u w:val="single"/>
+        </w:rPr>
+        <w:t>-</w:t>
+      </w:r>
+      <w:r>
+        <w:rPr>
+          <w:b/>
+          <w:bCs/>
+          <w:u w:val="single"/>
+        </w:rPr>
+        <w:t xml:space="preserve"> </w:t>
+      </w:r>
+      <w:r>
+        <w:rPr>
+          <w:b/>
+          <w:bCs/>
+          <w:u w:val="single"/>
+        </w:rPr>
+        <w:t>Based Marketplace | Full-Stack Developer</w:t>
       </w:r>
     </w:p>
     <w:p>
@@ -739,16 +816,12 @@
         <w:t xml:space="preserve"> </w:t>
       </w:r>
       <w:r>
-        <w:t xml:space="preserve">Built an AI-powered exam marking platform that evaluates student answers using semantic similarity (Sentence-BERT), providing instant, accurate scores and </w:t>
-      </w:r>
+        <w:t>Built an AI-powered exam marking platform that evaluates student answers using semantic similarity (Sentence-BERT), providing instant, accurate scores and feedback. Features include role-based dashboards, RESTful APIs, and asynchronous grading workflows—reducing lecturer workload by 80% while enhancing student learning through immediate feedback.</w:t>
+      </w:r>
+    </w:p>
+    <w:p>
       <w:r>
         <w:lastRenderedPageBreak/>
-        <w:t>feedback. Features include role-based dashboards, RESTful APIs, and asynchronous grading workflows—reducing lecturer workload by 80% while enhancing student learning through immediate feedback.</w:t>
-      </w:r>
-    </w:p>
-    <w:p/>
-    <w:p>
-      <w:r>
         <w:pict w14:anchorId="2651BF85">
           <v:rect id="_x0000_i1030" style="width:0;height:1.5pt" o:hralign="center" o:hrstd="t" o:hr="t" fillcolor="#a0a0a0" stroked="f"/>
         </w:pict>
@@ -807,6 +880,28 @@
       </w:r>
       <w:r>
         <w:t xml:space="preserve"> 2</w:t>
+      </w:r>
+    </w:p>
+    <w:p>
+      <w:pPr>
+        <w:rPr>
+          <w:b/>
+          <w:bCs/>
+        </w:rPr>
+      </w:pPr>
+      <w:r>
+        <w:rPr>
+          <w:b/>
+          <w:bCs/>
+        </w:rPr>
+        <w:t>Expected graduation year</w:t>
+      </w:r>
+      <w:r>
+        <w:rPr>
+          <w:b/>
+          <w:bCs/>
+        </w:rPr>
+        <w:t>: 2028</w:t>
       </w:r>
     </w:p>
     <w:p>
@@ -839,7 +934,7 @@
         </w:numPr>
       </w:pPr>
       <w:r>
-        <w:t>Collaborated on real-world AI and full-stack development projects addressing healthcare, agriculture, and e-commerce challenges</w:t>
+        <w:t>Collaborated on real-world AI and full-stack development projects addressing healthcare, agriculture and e-commerce challenges</w:t>
       </w:r>
     </w:p>
     <w:p>
@@ -888,7 +983,13 @@
     </w:p>
     <w:p>
       <w:r>
-        <w:t>Artificial Intelligence, HealthTech, Aggrotech, Software Innovation, Problem Solving</w:t>
+        <w:t>Artificial Intelligence, HealthTech, Aggrotech, Software Innovation</w:t>
+      </w:r>
+      <w:r>
+        <w:t xml:space="preserve"> and </w:t>
+      </w:r>
+      <w:r>
+        <w:t>Problem Solving</w:t>
       </w:r>
     </w:p>
     <w:p/>
@@ -922,9 +1023,9 @@
     </w:pict>
   </w:numPicBullet>
   <w:abstractNum w:abstractNumId="0" w15:restartNumberingAfterBreak="0">
-    <w:nsid w:val="118E2ED2"/>
+    <w:nsid w:val="05972523"/>
     <w:multiLevelType w:val="multilevel"/>
-    <w:tmpl w:val="F780A3DE"/>
+    <w:tmpl w:val="CEEA8484"/>
     <w:lvl w:ilvl="0">
       <w:start w:val="1"/>
       <w:numFmt w:val="bullet"/>
@@ -1071,6 +1172,155 @@
     </w:lvl>
   </w:abstractNum>
   <w:abstractNum w:abstractNumId="1" w15:restartNumberingAfterBreak="0">
+    <w:nsid w:val="118E2ED2"/>
+    <w:multiLevelType w:val="multilevel"/>
+    <w:tmpl w:val="F780A3DE"/>
+    <w:lvl w:ilvl="0">
+      <w:start w:val="1"/>
+      <w:numFmt w:val="bullet"/>
+      <w:lvlText w:val=""/>
+      <w:lvlJc w:val="left"/>
+      <w:pPr>
+        <w:tabs>
+          <w:tab w:val="num" w:pos="720"/>
+        </w:tabs>
+        <w:ind w:left="720" w:hanging="360"/>
+      </w:pPr>
+      <w:rPr>
+        <w:rFonts w:ascii="Symbol" w:hAnsi="Symbol" w:hint="default"/>
+        <w:sz w:val="20"/>
+      </w:rPr>
+    </w:lvl>
+    <w:lvl w:ilvl="1" w:tentative="1">
+      <w:start w:val="1"/>
+      <w:numFmt w:val="bullet"/>
+      <w:lvlText w:val="o"/>
+      <w:lvlJc w:val="left"/>
+      <w:pPr>
+        <w:tabs>
+          <w:tab w:val="num" w:pos="1440"/>
+        </w:tabs>
+        <w:ind w:left="1440" w:hanging="360"/>
+      </w:pPr>
+      <w:rPr>
+        <w:rFonts w:ascii="Courier New" w:hAnsi="Courier New" w:hint="default"/>
+        <w:sz w:val="20"/>
+      </w:rPr>
+    </w:lvl>
+    <w:lvl w:ilvl="2" w:tentative="1">
+      <w:start w:val="1"/>
+      <w:numFmt w:val="bullet"/>
+      <w:lvlText w:val=""/>
+      <w:lvlJc w:val="left"/>
+      <w:pPr>
+        <w:tabs>
+          <w:tab w:val="num" w:pos="2160"/>
+        </w:tabs>
+        <w:ind w:left="2160" w:hanging="360"/>
+      </w:pPr>
+      <w:rPr>
+        <w:rFonts w:ascii="Wingdings" w:hAnsi="Wingdings" w:hint="default"/>
+        <w:sz w:val="20"/>
+      </w:rPr>
+    </w:lvl>
+    <w:lvl w:ilvl="3" w:tentative="1">
+      <w:start w:val="1"/>
+      <w:numFmt w:val="bullet"/>
+      <w:lvlText w:val=""/>
+      <w:lvlJc w:val="left"/>
+      <w:pPr>
+        <w:tabs>
+          <w:tab w:val="num" w:pos="2880"/>
+        </w:tabs>
+        <w:ind w:left="2880" w:hanging="360"/>
+      </w:pPr>
+      <w:rPr>
+        <w:rFonts w:ascii="Wingdings" w:hAnsi="Wingdings" w:hint="default"/>
+        <w:sz w:val="20"/>
+      </w:rPr>
+    </w:lvl>
+    <w:lvl w:ilvl="4" w:tentative="1">
+      <w:start w:val="1"/>
+      <w:numFmt w:val="bullet"/>
+      <w:lvlText w:val=""/>
+      <w:lvlJc w:val="left"/>
+      <w:pPr>
+        <w:tabs>
+          <w:tab w:val="num" w:pos="3600"/>
+        </w:tabs>
+        <w:ind w:left="3600" w:hanging="360"/>
+      </w:pPr>
+      <w:rPr>
+        <w:rFonts w:ascii="Wingdings" w:hAnsi="Wingdings" w:hint="default"/>
+        <w:sz w:val="20"/>
+      </w:rPr>
+    </w:lvl>
+    <w:lvl w:ilvl="5" w:tentative="1">
+      <w:start w:val="1"/>
+      <w:numFmt w:val="bullet"/>
+      <w:lvlText w:val=""/>
+      <w:lvlJc w:val="left"/>
+      <w:pPr>
+        <w:tabs>
+          <w:tab w:val="num" w:pos="4320"/>
+        </w:tabs>
+        <w:ind w:left="4320" w:hanging="360"/>
+      </w:pPr>
+      <w:rPr>
+        <w:rFonts w:ascii="Wingdings" w:hAnsi="Wingdings" w:hint="default"/>
+        <w:sz w:val="20"/>
+      </w:rPr>
+    </w:lvl>
+    <w:lvl w:ilvl="6" w:tentative="1">
+      <w:start w:val="1"/>
+      <w:numFmt w:val="bullet"/>
+      <w:lvlText w:val=""/>
+      <w:lvlJc w:val="left"/>
+      <w:pPr>
+        <w:tabs>
+          <w:tab w:val="num" w:pos="5040"/>
+        </w:tabs>
+        <w:ind w:left="5040" w:hanging="360"/>
+      </w:pPr>
+      <w:rPr>
+        <w:rFonts w:ascii="Wingdings" w:hAnsi="Wingdings" w:hint="default"/>
+        <w:sz w:val="20"/>
+      </w:rPr>
+    </w:lvl>
+    <w:lvl w:ilvl="7" w:tentative="1">
+      <w:start w:val="1"/>
+      <w:numFmt w:val="bullet"/>
+      <w:lvlText w:val=""/>
+      <w:lvlJc w:val="left"/>
+      <w:pPr>
+        <w:tabs>
+          <w:tab w:val="num" w:pos="5760"/>
+        </w:tabs>
+        <w:ind w:left="5760" w:hanging="360"/>
+      </w:pPr>
+      <w:rPr>
+        <w:rFonts w:ascii="Wingdings" w:hAnsi="Wingdings" w:hint="default"/>
+        <w:sz w:val="20"/>
+      </w:rPr>
+    </w:lvl>
+    <w:lvl w:ilvl="8" w:tentative="1">
+      <w:start w:val="1"/>
+      <w:numFmt w:val="bullet"/>
+      <w:lvlText w:val=""/>
+      <w:lvlJc w:val="left"/>
+      <w:pPr>
+        <w:tabs>
+          <w:tab w:val="num" w:pos="6480"/>
+        </w:tabs>
+        <w:ind w:left="6480" w:hanging="360"/>
+      </w:pPr>
+      <w:rPr>
+        <w:rFonts w:ascii="Wingdings" w:hAnsi="Wingdings" w:hint="default"/>
+        <w:sz w:val="20"/>
+      </w:rPr>
+    </w:lvl>
+  </w:abstractNum>
+  <w:abstractNum w:abstractNumId="2" w15:restartNumberingAfterBreak="0">
     <w:nsid w:val="63770663"/>
     <w:multiLevelType w:val="hybridMultilevel"/>
     <w:tmpl w:val="4540FA30"/>
@@ -1160,10 +1410,13 @@
     </w:lvl>
   </w:abstractNum>
   <w:num w:numId="1" w16cid:durableId="175585751">
-    <w:abstractNumId w:val="0"/>
+    <w:abstractNumId w:val="1"/>
   </w:num>
   <w:num w:numId="2" w16cid:durableId="1825193645">
-    <w:abstractNumId w:val="1"/>
+    <w:abstractNumId w:val="2"/>
+  </w:num>
+  <w:num w:numId="3" w16cid:durableId="752437073">
+    <w:abstractNumId w:val="0"/>
   </w:num>
 </w:numbering>
 </file>

</xml_diff>

<commit_message>
🎨 Portfolio Update: - Added dark/light mode toggle with theme context - Unified teal color scheme throughout - Added animated border buttons and glass morphism - Made avatar circular and smaller - Added Download CV button - Removed About page - Fixed responsive design issues - Added premium card hover effects
</commit_message>
<xml_diff>
--- a/JOSHUA TEVERA Cv.docx
+++ b/JOSHUA TEVERA Cv.docx
@@ -30,7 +30,7 @@
           <w:b/>
           <w:bCs/>
         </w:rPr>
-        <w:t xml:space="preserve">Software Engineering Student | Full Stack Developer </w:t>
+        <w:t xml:space="preserve">Software Engineering </w:t>
       </w:r>
     </w:p>
     <w:p>
@@ -126,6 +126,9 @@
         <w:t>)</w:t>
       </w:r>
       <w:r>
+        <w:t xml:space="preserve"> </w:t>
+      </w:r>
+      <w:r>
         <w:br/>
       </w:r>
       <w:r>
@@ -439,7 +442,21 @@
           <w:b/>
           <w:bCs/>
         </w:rPr>
-        <w:t>- Developed complete online store with user authentication, shopping cart, and payment processing</w:t>
+        <w:t>- Developed complete online store with user authentication, shopping cart</w:t>
+      </w:r>
+      <w:r>
+        <w:rPr>
+          <w:b/>
+          <w:bCs/>
+        </w:rPr>
+        <w:t xml:space="preserve"> </w:t>
+      </w:r>
+      <w:r>
+        <w:rPr>
+          <w:b/>
+          <w:bCs/>
+        </w:rPr>
+        <w:t>and payment processing</w:t>
       </w:r>
     </w:p>
     <w:p>
@@ -485,7 +502,7 @@
           <w:b/>
           <w:bCs/>
         </w:rPr>
-        <w:t>- Implemented JWT authentication, PostgreSQL database, and admin dashboard</w:t>
+        <w:t>- Implemented JWT authentication, PostgreSQL database and admin dashboard</w:t>
       </w:r>
     </w:p>
     <w:p>
@@ -873,10 +890,20 @@
       </w:r>
       <w:r>
         <w:rPr>
-          <w:b/>
-          <w:bCs/>
-        </w:rPr>
-        <w:t>Level:</w:t>
+          <w:rFonts w:ascii="Abadi ExtraLight" w:hAnsi="Abadi ExtraLight"/>
+          <w:b/>
+          <w:bCs/>
+          <w:i/>
+          <w:iCs/>
+        </w:rPr>
+        <w:t>Level</w:t>
+      </w:r>
+      <w:r>
+        <w:rPr>
+          <w:b/>
+          <w:bCs/>
+        </w:rPr>
+        <w:t>:</w:t>
       </w:r>
       <w:r>
         <w:t xml:space="preserve"> 2</w:t>
@@ -887,12 +914,17 @@
         <w:rPr>
           <w:b/>
           <w:bCs/>
-        </w:rPr>
-      </w:pPr>
-      <w:r>
-        <w:rPr>
-          <w:b/>
-          <w:bCs/>
+          <w:i/>
+          <w:iCs/>
+        </w:rPr>
+      </w:pPr>
+      <w:r>
+        <w:rPr>
+          <w:rFonts w:ascii="Abadi ExtraLight" w:hAnsi="Abadi ExtraLight"/>
+          <w:b/>
+          <w:bCs/>
+          <w:i/>
+          <w:iCs/>
         </w:rPr>
         <w:t>Expected graduation year</w:t>
       </w:r>
@@ -900,6 +932,8 @@
         <w:rPr>
           <w:b/>
           <w:bCs/>
+          <w:i/>
+          <w:iCs/>
         </w:rPr>
         <w:t>: 2028</w:t>
       </w:r>
@@ -2024,6 +2058,7 @@
   <w:style w:type="character" w:default="1" w:styleId="DefaultParagraphFont">
     <w:name w:val="Default Paragraph Font"/>
     <w:uiPriority w:val="1"/>
+    <w:semiHidden/>
     <w:unhideWhenUsed/>
   </w:style>
   <w:style w:type="table" w:default="1" w:styleId="TableNormal">

</xml_diff>